<commit_message>
Updated Build Guides, moved old build to Old Build and then created Projects\bubblefish to do revised build.
</commit_message>
<xml_diff>
--- a/BubbleFish - Planning/Build/2026.03.26 - Revised - BubbleFish_Community_Pivot_Guide.docx
+++ b/BubbleFish - Planning/Build/2026.03.26 - Revised - BubbleFish_Community_Pivot_Guide.docx
@@ -205,12 +205,6 @@
         <w:gridCol w:w="6059"/>
       </w:tblGrid>
       <w:tr>
-        <w:tblPrEx>
-          <w:tblCellMar>
-            <w:top w:w="0" w:type="dxa"/>
-            <w:bottom w:w="0" w:type="dxa"/>
-          </w:tblCellMar>
-        </w:tblPrEx>
         <w:tc>
           <w:tcPr>
             <w:tcW w:w="2200" w:type="dxa"/>
@@ -303,12 +297,6 @@
         </w:tc>
       </w:tr>
       <w:tr>
-        <w:tblPrEx>
-          <w:tblCellMar>
-            <w:top w:w="0" w:type="dxa"/>
-            <w:bottom w:w="0" w:type="dxa"/>
-          </w:tblCellMar>
-        </w:tblPrEx>
         <w:tc>
           <w:tcPr>
             <w:tcW w:w="2200" w:type="dxa"/>
@@ -441,12 +429,6 @@
         </w:tc>
       </w:tr>
       <w:tr>
-        <w:tblPrEx>
-          <w:tblCellMar>
-            <w:top w:w="0" w:type="dxa"/>
-            <w:bottom w:w="0" w:type="dxa"/>
-          </w:tblCellMar>
-        </w:tblPrEx>
         <w:tc>
           <w:tcPr>
             <w:tcW w:w="2200" w:type="dxa"/>
@@ -563,12 +545,6 @@
         </w:tc>
       </w:tr>
       <w:tr>
-        <w:tblPrEx>
-          <w:tblCellMar>
-            <w:top w:w="0" w:type="dxa"/>
-            <w:bottom w:w="0" w:type="dxa"/>
-          </w:tblCellMar>
-        </w:tblPrEx>
         <w:tc>
           <w:tcPr>
             <w:tcW w:w="2200" w:type="dxa"/>
@@ -678,12 +654,6 @@
         </w:tc>
       </w:tr>
       <w:tr>
-        <w:tblPrEx>
-          <w:tblCellMar>
-            <w:top w:w="0" w:type="dxa"/>
-            <w:bottom w:w="0" w:type="dxa"/>
-          </w:tblCellMar>
-        </w:tblPrEx>
         <w:tc>
           <w:tcPr>
             <w:tcW w:w="2200" w:type="dxa"/>
@@ -893,12 +863,6 @@
         </w:tc>
       </w:tr>
       <w:tr>
-        <w:tblPrEx>
-          <w:tblCellMar>
-            <w:top w:w="0" w:type="dxa"/>
-            <w:bottom w:w="0" w:type="dxa"/>
-          </w:tblCellMar>
-        </w:tblPrEx>
         <w:tc>
           <w:tcPr>
             <w:tcW w:w="2200" w:type="dxa"/>
@@ -1049,12 +1013,6 @@
         </w:tc>
       </w:tr>
       <w:tr>
-        <w:tblPrEx>
-          <w:tblCellMar>
-            <w:top w:w="0" w:type="dxa"/>
-            <w:bottom w:w="0" w:type="dxa"/>
-          </w:tblCellMar>
-        </w:tblPrEx>
         <w:tc>
           <w:tcPr>
             <w:tcW w:w="2200" w:type="dxa"/>
@@ -1196,12 +1154,6 @@
         </w:tc>
       </w:tr>
       <w:tr>
-        <w:tblPrEx>
-          <w:tblCellMar>
-            <w:top w:w="0" w:type="dxa"/>
-            <w:bottom w:w="0" w:type="dxa"/>
-          </w:tblCellMar>
-        </w:tblPrEx>
         <w:tc>
           <w:tcPr>
             <w:tcW w:w="2200" w:type="dxa"/>
@@ -1327,12 +1279,6 @@
         </w:tc>
       </w:tr>
       <w:tr>
-        <w:tblPrEx>
-          <w:tblCellMar>
-            <w:top w:w="0" w:type="dxa"/>
-            <w:bottom w:w="0" w:type="dxa"/>
-          </w:tblCellMar>
-        </w:tblPrEx>
         <w:tc>
           <w:tcPr>
             <w:tcW w:w="2200" w:type="dxa"/>
@@ -1506,12 +1452,6 @@
         </w:tc>
       </w:tr>
       <w:tr>
-        <w:tblPrEx>
-          <w:tblCellMar>
-            <w:top w:w="0" w:type="dxa"/>
-            <w:bottom w:w="0" w:type="dxa"/>
-          </w:tblCellMar>
-        </w:tblPrEx>
         <w:tc>
           <w:tcPr>
             <w:tcW w:w="2200" w:type="dxa"/>
@@ -1637,12 +1577,6 @@
         </w:tc>
       </w:tr>
       <w:tr>
-        <w:tblPrEx>
-          <w:tblCellMar>
-            <w:top w:w="0" w:type="dxa"/>
-            <w:bottom w:w="0" w:type="dxa"/>
-          </w:tblCellMar>
-        </w:tblPrEx>
         <w:tc>
           <w:tcPr>
             <w:tcW w:w="2200" w:type="dxa"/>
@@ -1849,12 +1783,6 @@
         </w:tc>
       </w:tr>
       <w:tr>
-        <w:tblPrEx>
-          <w:tblCellMar>
-            <w:top w:w="0" w:type="dxa"/>
-            <w:bottom w:w="0" w:type="dxa"/>
-          </w:tblCellMar>
-        </w:tblPrEx>
         <w:tc>
           <w:tcPr>
             <w:tcW w:w="2200" w:type="dxa"/>
@@ -2051,12 +1979,6 @@
         </w:tc>
       </w:tr>
       <w:tr>
-        <w:tblPrEx>
-          <w:tblCellMar>
-            <w:top w:w="0" w:type="dxa"/>
-            <w:bottom w:w="0" w:type="dxa"/>
-          </w:tblCellMar>
-        </w:tblPrEx>
         <w:tc>
           <w:tcPr>
             <w:tcW w:w="2200" w:type="dxa"/>
@@ -2198,12 +2120,6 @@
         </w:tc>
       </w:tr>
       <w:tr>
-        <w:tblPrEx>
-          <w:tblCellMar>
-            <w:top w:w="0" w:type="dxa"/>
-            <w:bottom w:w="0" w:type="dxa"/>
-          </w:tblCellMar>
-        </w:tblPrEx>
         <w:tc>
           <w:tcPr>
             <w:tcW w:w="2200" w:type="dxa"/>
@@ -2299,12 +2215,6 @@
         </w:tc>
       </w:tr>
       <w:tr>
-        <w:tblPrEx>
-          <w:tblCellMar>
-            <w:top w:w="0" w:type="dxa"/>
-            <w:bottom w:w="0" w:type="dxa"/>
-          </w:tblCellMar>
-        </w:tblPrEx>
         <w:tc>
           <w:tcPr>
             <w:tcW w:w="2200" w:type="dxa"/>
@@ -2453,12 +2363,6 @@
         </w:tc>
       </w:tr>
       <w:tr>
-        <w:tblPrEx>
-          <w:tblCellMar>
-            <w:top w:w="0" w:type="dxa"/>
-            <w:bottom w:w="0" w:type="dxa"/>
-          </w:tblCellMar>
-        </w:tblPrEx>
         <w:tc>
           <w:tcPr>
             <w:tcW w:w="2200" w:type="dxa"/>
@@ -2584,12 +2488,6 @@
         </w:tc>
       </w:tr>
       <w:tr>
-        <w:tblPrEx>
-          <w:tblCellMar>
-            <w:top w:w="0" w:type="dxa"/>
-            <w:bottom w:w="0" w:type="dxa"/>
-          </w:tblCellMar>
-        </w:tblPrEx>
         <w:tc>
           <w:tcPr>
             <w:tcW w:w="2200" w:type="dxa"/>
@@ -2699,12 +2597,6 @@
         </w:tc>
       </w:tr>
       <w:tr>
-        <w:tblPrEx>
-          <w:tblCellMar>
-            <w:top w:w="0" w:type="dxa"/>
-            <w:bottom w:w="0" w:type="dxa"/>
-          </w:tblCellMar>
-        </w:tblPrEx>
         <w:tc>
           <w:tcPr>
             <w:tcW w:w="2200" w:type="dxa"/>
@@ -2798,12 +2690,6 @@
         </w:tc>
       </w:tr>
       <w:tr>
-        <w:tblPrEx>
-          <w:tblCellMar>
-            <w:top w:w="0" w:type="dxa"/>
-            <w:bottom w:w="0" w:type="dxa"/>
-          </w:tblCellMar>
-        </w:tblPrEx>
         <w:tc>
           <w:tcPr>
             <w:tcW w:w="2200" w:type="dxa"/>
@@ -2897,12 +2783,6 @@
         </w:tc>
       </w:tr>
       <w:tr>
-        <w:tblPrEx>
-          <w:tblCellMar>
-            <w:top w:w="0" w:type="dxa"/>
-            <w:bottom w:w="0" w:type="dxa"/>
-          </w:tblCellMar>
-        </w:tblPrEx>
         <w:tc>
           <w:tcPr>
             <w:tcW w:w="2200" w:type="dxa"/>
@@ -3012,12 +2892,6 @@
         </w:tc>
       </w:tr>
       <w:tr>
-        <w:tblPrEx>
-          <w:tblCellMar>
-            <w:top w:w="0" w:type="dxa"/>
-            <w:bottom w:w="0" w:type="dxa"/>
-          </w:tblCellMar>
-        </w:tblPrEx>
         <w:tc>
           <w:tcPr>
             <w:tcW w:w="2200" w:type="dxa"/>
@@ -3102,12 +2976,6 @@
         </w:tc>
       </w:tr>
       <w:tr>
-        <w:tblPrEx>
-          <w:tblCellMar>
-            <w:top w:w="0" w:type="dxa"/>
-            <w:bottom w:w="0" w:type="dxa"/>
-          </w:tblCellMar>
-        </w:tblPrEx>
         <w:tc>
           <w:tcPr>
             <w:tcW w:w="2200" w:type="dxa"/>

</xml_diff>